<commit_message>
Update portfolio w/ cs
</commit_message>
<xml_diff>
--- a/public/John-Rey-Baliguat-ATS-Resume.docx
+++ b/public/John-Rey-Baliguat-ATS-Resume.docx
@@ -28,7 +28,7 @@
           <w:color w:val="1B428F"/>
           <w:sz w:val="18"/>
         </w:rPr>
-        <w:t>Technical Support | Customer Support | Administrative Operations | Web Systems</w:t>
+        <w:t>Technical Support | E-commerce Support | Customer and Administrative Operations | Web Systems</w:t>
       </w:r>
     </w:p>
     <w:p>
@@ -76,7 +76,7 @@
           <w:color w:val="242A32"/>
           <w:sz w:val="18"/>
         </w:rPr>
-        <w:t>Bachelor of Science in Information Technology graduate with approximately two years of hands-on web, hardware, and technical project experience. Supports users, administrative and customer workflows, business platforms, websites, device and printer installation, maintenance, quality assurance, databases, deployment, and API integrations. Learns unfamiliar systems and procedures carefully, communicates clearly, and verifies completed work.</w:t>
+        <w:t>Bachelor of Science in Information Technology graduate with approximately two years of hands-on web, hardware, and technical project experience. Supports users, customer and administrative workflows, websites, business systems, hardware, printers, quality assurance, databases, deployment, and API integrations. Open to e-commerce support roles involving storefront, product, order, and customer operations. Licensed real estate salesperson with light industry experience in property, inquiry, and lead workflows.</w:t>
       </w:r>
     </w:p>
     <w:p>
@@ -110,7 +110,7 @@
           <w:color w:val="242A32"/>
           <w:sz w:val="18"/>
         </w:rPr>
-        <w:t>Technical support and troubleshooting | Customer assistance by email and chat | Administrative and operations support | Business system familiarization | Record maintenance and documentation | Issue reproduction and escalation | Website and system maintenance | Software, printer, and peripheral installation | Basic hardware setup and troubleshooting | QA testing and workflow verification | Database-backed workflows | Responsive and mobile testing | REST API integration</w:t>
+        <w:t>Technical support and troubleshooting | Customer assistance by email and chat | Administrative and operations support | E-commerce storefront, product, and order support | Business system familiarization | Record maintenance and documentation | Issue reproduction and escalation | Website and system maintenance | Software, printer, and peripheral installation | Basic hardware setup and troubleshooting | QA testing and workflow verification | Database-backed workflows | Responsive and mobile testing | REST API integration</w:t>
       </w:r>
     </w:p>
     <w:p>
@@ -582,7 +582,7 @@
           <w:color w:val="000000"/>
           <w:sz w:val="19"/>
         </w:rPr>
-        <w:t>TRAINING AND CERTIFICATES</w:t>
+        <w:t>LICENSES AND TRAINING</w:t>
       </w:r>
     </w:p>
     <w:p>
@@ -597,7 +597,7 @@
           <w:color w:val="242A32"/>
           <w:sz w:val="18"/>
         </w:rPr>
-        <w:t>Real Estate Brokerage Seminar for Real Estate Salespersons, 12 credit units | Philippines Center for Real Estate Professional Studies, Inc. | June 20-21, 2026 • Explainable AI (XAI) and Front-End Web Development Essentials webinars | West Visayas State University CICT | September 27, 2024 • Career Development in IT: From College to Industry | West Visayas State University CICT | September 28, 2024 • Azure AZ-104 Insight learning event | Styava.dev | September 25, 2024</w:t>
+        <w:t>Licensed Real Estate Salesperson | Light real-estate experience | Philippines • Real Estate Brokerage Seminar for Real Estate Salespersons, 12 credit units | Philippines Center for Real Estate Professional Studies, Inc. | June 20-21, 2026 • Explainable AI (XAI) and Front-End Web Development Essentials webinars | West Visayas State University CICT | September 27, 2024 • Career Development in IT: From College to Industry | West Visayas State University CICT | September 28, 2024 • Azure AZ-104 Insight learning event | Styava.dev | September 25, 2024</w:t>
       </w:r>
     </w:p>
     <w:sectPr>

</xml_diff>